<commit_message>
Ran and initialised project
</commit_message>
<xml_diff>
--- a/Milestone 2/CivicConnect_M2_Person3_PED_v2.docx
+++ b/Milestone 2/CivicConnect_M2_Person3_PED_v2.docx
@@ -12361,15 +12361,7 @@
                 <w:sz w:val="17"/>
                 <w:szCs w:val="17"/>
               </w:rPr>
-              <w:t xml:space="preserve">Settings → Branches; </w:t>
-            </w:r>
-            <w:r>
-              <w:rPr>
-                <w:sz w:val="17"/>
-                <w:szCs w:val="17"/>
-                <w:highlight w:val="yellow"/>
-              </w:rPr>
-              <w:t>«screenshot/link»</w:t>
+              <w:t>https://github.com/Armand-JV/SEN381-Project/settings/rules/22544388</w:t>
             </w:r>
           </w:p>
         </w:tc>
@@ -12437,9 +12429,8 @@
               <w:rPr>
                 <w:sz w:val="17"/>
                 <w:szCs w:val="17"/>
-                <w:highlight w:val="yellow"/>
-              </w:rPr>
-              <w:t>«confirm»</w:t>
+              </w:rPr>
+              <w:t>Open</w:t>
             </w:r>
           </w:p>
         </w:tc>
@@ -12467,9 +12458,8 @@
               <w:rPr>
                 <w:sz w:val="17"/>
                 <w:szCs w:val="17"/>
-                <w:highlight w:val="yellow"/>
-              </w:rPr>
-              <w:t>«Issues link, milestone M2»</w:t>
+              </w:rPr>
+              <w:t>https://github.com/Armand-JV/SEN381-Project/issues</w:t>
             </w:r>
           </w:p>
         </w:tc>
@@ -12537,9 +12527,8 @@
               <w:rPr>
                 <w:sz w:val="17"/>
                 <w:szCs w:val="17"/>
-                <w:highlight w:val="yellow"/>
-              </w:rPr>
-              <w:t>«confirm»</w:t>
+              </w:rPr>
+              <w:t>Open</w:t>
             </w:r>
           </w:p>
         </w:tc>
@@ -12567,9 +12556,8 @@
               <w:rPr>
                 <w:sz w:val="17"/>
                 <w:szCs w:val="17"/>
-                <w:highlight w:val="yellow"/>
-              </w:rPr>
-              <w:t>«Branch list»</w:t>
+              </w:rPr>
+              <w:t>https://github.com/Armand-JV/SEN381-Project/branches</w:t>
             </w:r>
           </w:p>
         </w:tc>
@@ -12666,9 +12654,8 @@
               <w:rPr>
                 <w:sz w:val="17"/>
                 <w:szCs w:val="17"/>
-                <w:highlight w:val="yellow"/>
-              </w:rPr>
-              <w:t>«Merged PR links»</w:t>
+              </w:rPr>
+              <w:t>https://github.com/Armand-JV/SEN381-Project/pull/2</w:t>
             </w:r>
           </w:p>
         </w:tc>
@@ -12766,7 +12753,7 @@
                 <w:sz w:val="17"/>
                 <w:szCs w:val="17"/>
               </w:rPr>
-              <w:t>https://github.com/Armand-JV/SEN381-Project/pull/2</w:t>
+              <w:t>https://github.com/Armand-JV/SEN381-Project/pull/1</w:t>
             </w:r>
           </w:p>
         </w:tc>
@@ -12932,9 +12919,8 @@
               <w:rPr>
                 <w:sz w:val="17"/>
                 <w:szCs w:val="17"/>
-                <w:highlight w:val="yellow"/>
-              </w:rPr>
-              <w:t>«confirm»</w:t>
+              </w:rPr>
+              <w:t>Done</w:t>
             </w:r>
           </w:p>
         </w:tc>
@@ -12962,9 +12948,8 @@
               <w:rPr>
                 <w:sz w:val="17"/>
                 <w:szCs w:val="17"/>
-                <w:highlight w:val="yellow"/>
-              </w:rPr>
-              <w:t>«Actions run link»</w:t>
+              </w:rPr>
+              <w:t>https://github.com/Armand-JV/SEN381-Project/actions/workflows/test.yml</w:t>
             </w:r>
           </w:p>
         </w:tc>
@@ -13020,27 +13005,17 @@
                 <w:sz w:val="17"/>
                 <w:szCs w:val="17"/>
               </w:rPr>
-              <w:t>.</w:t>
-            </w:r>
-            <w:proofErr w:type="spellStart"/>
+              <w:t>.env</w:t>
+            </w:r>
+            <w:proofErr w:type="gramEnd"/>
             <w:r>
               <w:rPr>
                 <w:rFonts w:ascii="Consolas" w:eastAsia="Consolas" w:hAnsi="Consolas" w:cs="Consolas"/>
                 <w:sz w:val="17"/>
                 <w:szCs w:val="17"/>
               </w:rPr>
-              <w:t>env</w:t>
-            </w:r>
-            <w:proofErr w:type="gramEnd"/>
-            <w:r>
-              <w:rPr>
-                <w:rFonts w:ascii="Consolas" w:eastAsia="Consolas" w:hAnsi="Consolas" w:cs="Consolas"/>
-                <w:sz w:val="17"/>
-                <w:szCs w:val="17"/>
-              </w:rPr>
-              <w:t>.example</w:t>
-            </w:r>
-            <w:proofErr w:type="spellEnd"/>
+              <w:t xml:space="preserve"> not</w:t>
+            </w:r>
             <w:r>
               <w:rPr>
                 <w:sz w:val="17"/>
@@ -13103,9 +13078,8 @@
               <w:rPr>
                 <w:sz w:val="17"/>
                 <w:szCs w:val="17"/>
-                <w:highlight w:val="yellow"/>
-              </w:rPr>
-              <w:t>«File links»</w:t>
+              </w:rPr>
+              <w:t>https://github.com/Armand-JV/SEN381-Project</w:t>
             </w:r>
           </w:p>
         </w:tc>
@@ -13145,6 +13119,7 @@
                 <w:sz w:val="17"/>
                 <w:szCs w:val="17"/>
               </w:rPr>
+              <w:lastRenderedPageBreak/>
               <w:t>README and technical docs present and current</w:t>
             </w:r>
           </w:p>
@@ -13202,9 +13177,8 @@
               <w:rPr>
                 <w:sz w:val="17"/>
                 <w:szCs w:val="17"/>
-                <w:highlight w:val="yellow"/>
-              </w:rPr>
-              <w:t>«README link»</w:t>
+              </w:rPr>
+              <w:t>https://github.com/Armand-JV/SEN381-Project/blob/main/README.md</w:t>
             </w:r>
           </w:p>
         </w:tc>
@@ -13223,618 +13197,47 @@
         <w:t>D.3 Contribution record</w:t>
       </w:r>
     </w:p>
-    <w:tbl>
-      <w:tblPr>
-        <w:tblW w:w="9906" w:type="dxa"/>
-        <w:tblBorders>
-          <w:top w:val="single" w:sz="4" w:space="0" w:color="auto"/>
-          <w:left w:val="single" w:sz="4" w:space="0" w:color="auto"/>
-          <w:bottom w:val="single" w:sz="4" w:space="0" w:color="auto"/>
-          <w:right w:val="single" w:sz="4" w:space="0" w:color="auto"/>
-          <w:insideH w:val="single" w:sz="4" w:space="0" w:color="auto"/>
-          <w:insideV w:val="single" w:sz="4" w:space="0" w:color="auto"/>
-        </w:tblBorders>
-        <w:tblCellMar>
-          <w:left w:w="10" w:type="dxa"/>
-          <w:right w:w="10" w:type="dxa"/>
-        </w:tblCellMar>
-        <w:tblLook w:val="0000" w:firstRow="0" w:lastRow="0" w:firstColumn="0" w:lastColumn="0" w:noHBand="0" w:noVBand="0"/>
-      </w:tblPr>
-      <w:tblGrid>
-        <w:gridCol w:w="3000"/>
-        <w:gridCol w:w="2000"/>
-        <w:gridCol w:w="2000"/>
-        <w:gridCol w:w="2906"/>
-      </w:tblGrid>
-      <w:tr>
-        <w:tblPrEx>
-          <w:tblCellMar>
-            <w:top w:w="0" w:type="dxa"/>
-            <w:bottom w:w="0" w:type="dxa"/>
-          </w:tblCellMar>
-        </w:tblPrEx>
-        <w:trPr>
-          <w:tblHeader/>
-        </w:trPr>
-        <w:tc>
-          <w:tcPr>
-            <w:tcW w:w="3000" w:type="dxa"/>
-            <w:tcBorders>
-              <w:top w:val="single" w:sz="4" w:space="0" w:color="9AA5B1"/>
-              <w:left w:val="single" w:sz="4" w:space="0" w:color="9AA5B1"/>
-              <w:bottom w:val="single" w:sz="4" w:space="0" w:color="9AA5B1"/>
-              <w:right w:val="single" w:sz="4" w:space="0" w:color="9AA5B1"/>
-            </w:tcBorders>
-            <w:shd w:val="clear" w:color="auto" w:fill="1F4E79"/>
-            <w:tcMar>
-              <w:top w:w="50" w:type="dxa"/>
-              <w:left w:w="80" w:type="dxa"/>
-              <w:bottom w:w="50" w:type="dxa"/>
-              <w:right w:w="80" w:type="dxa"/>
-            </w:tcMar>
-          </w:tcPr>
-          <w:p>
-            <w:pPr>
-              <w:spacing w:after="30"/>
-            </w:pPr>
-            <w:r>
-              <w:rPr>
-                <w:b/>
-                <w:bCs/>
-                <w:color w:val="FFFFFF"/>
-                <w:sz w:val="17"/>
-                <w:szCs w:val="17"/>
-              </w:rPr>
-              <w:lastRenderedPageBreak/>
-              <w:t>Member</w:t>
-            </w:r>
-          </w:p>
-        </w:tc>
-        <w:tc>
-          <w:tcPr>
-            <w:tcW w:w="2000" w:type="dxa"/>
-            <w:tcBorders>
-              <w:top w:val="single" w:sz="4" w:space="0" w:color="9AA5B1"/>
-              <w:left w:val="single" w:sz="4" w:space="0" w:color="9AA5B1"/>
-              <w:bottom w:val="single" w:sz="4" w:space="0" w:color="9AA5B1"/>
-              <w:right w:val="single" w:sz="4" w:space="0" w:color="9AA5B1"/>
-            </w:tcBorders>
-            <w:shd w:val="clear" w:color="auto" w:fill="1F4E79"/>
-            <w:tcMar>
-              <w:top w:w="50" w:type="dxa"/>
-              <w:left w:w="80" w:type="dxa"/>
-              <w:bottom w:w="50" w:type="dxa"/>
-              <w:right w:w="80" w:type="dxa"/>
-            </w:tcMar>
-          </w:tcPr>
-          <w:p>
-            <w:pPr>
-              <w:spacing w:after="30"/>
-            </w:pPr>
-            <w:r>
-              <w:rPr>
-                <w:b/>
-                <w:bCs/>
-                <w:color w:val="FFFFFF"/>
-                <w:sz w:val="17"/>
-                <w:szCs w:val="17"/>
-              </w:rPr>
-              <w:t>Merged PRs authored</w:t>
-            </w:r>
-          </w:p>
-        </w:tc>
-        <w:tc>
-          <w:tcPr>
-            <w:tcW w:w="2000" w:type="dxa"/>
-            <w:tcBorders>
-              <w:top w:val="single" w:sz="4" w:space="0" w:color="9AA5B1"/>
-              <w:left w:val="single" w:sz="4" w:space="0" w:color="9AA5B1"/>
-              <w:bottom w:val="single" w:sz="4" w:space="0" w:color="9AA5B1"/>
-              <w:right w:val="single" w:sz="4" w:space="0" w:color="9AA5B1"/>
-            </w:tcBorders>
-            <w:shd w:val="clear" w:color="auto" w:fill="1F4E79"/>
-            <w:tcMar>
-              <w:top w:w="50" w:type="dxa"/>
-              <w:left w:w="80" w:type="dxa"/>
-              <w:bottom w:w="50" w:type="dxa"/>
-              <w:right w:w="80" w:type="dxa"/>
-            </w:tcMar>
-          </w:tcPr>
-          <w:p>
-            <w:pPr>
-              <w:spacing w:after="30"/>
-            </w:pPr>
-            <w:r>
-              <w:rPr>
-                <w:b/>
-                <w:bCs/>
-                <w:color w:val="FFFFFF"/>
-                <w:sz w:val="17"/>
-                <w:szCs w:val="17"/>
-              </w:rPr>
-              <w:t>PRs reviewed</w:t>
-            </w:r>
-          </w:p>
-        </w:tc>
-        <w:tc>
-          <w:tcPr>
-            <w:tcW w:w="2906" w:type="dxa"/>
-            <w:tcBorders>
-              <w:top w:val="single" w:sz="4" w:space="0" w:color="9AA5B1"/>
-              <w:left w:val="single" w:sz="4" w:space="0" w:color="9AA5B1"/>
-              <w:bottom w:val="single" w:sz="4" w:space="0" w:color="9AA5B1"/>
-              <w:right w:val="single" w:sz="4" w:space="0" w:color="9AA5B1"/>
-            </w:tcBorders>
-            <w:shd w:val="clear" w:color="auto" w:fill="1F4E79"/>
-            <w:tcMar>
-              <w:top w:w="50" w:type="dxa"/>
-              <w:left w:w="80" w:type="dxa"/>
-              <w:bottom w:w="50" w:type="dxa"/>
-              <w:right w:w="80" w:type="dxa"/>
-            </w:tcMar>
-          </w:tcPr>
-          <w:p>
-            <w:pPr>
-              <w:spacing w:after="30"/>
-            </w:pPr>
-            <w:r>
-              <w:rPr>
-                <w:b/>
-                <w:bCs/>
-                <w:color w:val="FFFFFF"/>
-                <w:sz w:val="17"/>
-                <w:szCs w:val="17"/>
-              </w:rPr>
-              <w:t>Main artefacts</w:t>
-            </w:r>
-          </w:p>
-        </w:tc>
-      </w:tr>
-      <w:tr>
-        <w:tblPrEx>
-          <w:tblCellMar>
-            <w:top w:w="0" w:type="dxa"/>
-            <w:bottom w:w="0" w:type="dxa"/>
-          </w:tblCellMar>
-        </w:tblPrEx>
-        <w:trPr>
-          <w:cantSplit/>
-        </w:trPr>
-        <w:tc>
-          <w:tcPr>
-            <w:tcW w:w="3000" w:type="dxa"/>
-            <w:tcBorders>
-              <w:top w:val="single" w:sz="4" w:space="0" w:color="9AA5B1"/>
-              <w:left w:val="single" w:sz="4" w:space="0" w:color="9AA5B1"/>
-              <w:bottom w:val="single" w:sz="4" w:space="0" w:color="9AA5B1"/>
-              <w:right w:val="single" w:sz="4" w:space="0" w:color="9AA5B1"/>
-            </w:tcBorders>
-            <w:tcMar>
-              <w:top w:w="50" w:type="dxa"/>
-              <w:left w:w="80" w:type="dxa"/>
-              <w:bottom w:w="50" w:type="dxa"/>
-              <w:right w:w="80" w:type="dxa"/>
-            </w:tcMar>
-          </w:tcPr>
-          <w:p>
-            <w:pPr>
-              <w:spacing w:after="30"/>
-            </w:pPr>
-            <w:r>
-              <w:rPr>
-                <w:sz w:val="17"/>
-                <w:szCs w:val="17"/>
-              </w:rPr>
-              <w:t>Armand Vermeulen (Armand-JV)</w:t>
-            </w:r>
-          </w:p>
-        </w:tc>
-        <w:tc>
-          <w:tcPr>
-            <w:tcW w:w="2000" w:type="dxa"/>
-            <w:tcBorders>
-              <w:top w:val="single" w:sz="4" w:space="0" w:color="9AA5B1"/>
-              <w:left w:val="single" w:sz="4" w:space="0" w:color="9AA5B1"/>
-              <w:bottom w:val="single" w:sz="4" w:space="0" w:color="9AA5B1"/>
-              <w:right w:val="single" w:sz="4" w:space="0" w:color="9AA5B1"/>
-            </w:tcBorders>
-            <w:tcMar>
-              <w:top w:w="50" w:type="dxa"/>
-              <w:left w:w="80" w:type="dxa"/>
-              <w:bottom w:w="50" w:type="dxa"/>
-              <w:right w:w="80" w:type="dxa"/>
-            </w:tcMar>
-          </w:tcPr>
-          <w:p>
-            <w:pPr>
-              <w:spacing w:after="30"/>
-            </w:pPr>
-            <w:r>
-              <w:rPr>
-                <w:sz w:val="17"/>
-                <w:szCs w:val="17"/>
-                <w:highlight w:val="yellow"/>
-              </w:rPr>
-              <w:t>«#»</w:t>
-            </w:r>
-          </w:p>
-        </w:tc>
-        <w:tc>
-          <w:tcPr>
-            <w:tcW w:w="2000" w:type="dxa"/>
-            <w:tcBorders>
-              <w:top w:val="single" w:sz="4" w:space="0" w:color="9AA5B1"/>
-              <w:left w:val="single" w:sz="4" w:space="0" w:color="9AA5B1"/>
-              <w:bottom w:val="single" w:sz="4" w:space="0" w:color="9AA5B1"/>
-              <w:right w:val="single" w:sz="4" w:space="0" w:color="9AA5B1"/>
-            </w:tcBorders>
-            <w:tcMar>
-              <w:top w:w="50" w:type="dxa"/>
-              <w:left w:w="80" w:type="dxa"/>
-              <w:bottom w:w="50" w:type="dxa"/>
-              <w:right w:w="80" w:type="dxa"/>
-            </w:tcMar>
-          </w:tcPr>
-          <w:p>
-            <w:pPr>
-              <w:spacing w:after="30"/>
-            </w:pPr>
-            <w:r>
-              <w:rPr>
-                <w:sz w:val="17"/>
-                <w:szCs w:val="17"/>
-                <w:highlight w:val="yellow"/>
-              </w:rPr>
-              <w:t>«#»</w:t>
-            </w:r>
-          </w:p>
-        </w:tc>
-        <w:tc>
-          <w:tcPr>
-            <w:tcW w:w="2906" w:type="dxa"/>
-            <w:tcBorders>
-              <w:top w:val="single" w:sz="4" w:space="0" w:color="9AA5B1"/>
-              <w:left w:val="single" w:sz="4" w:space="0" w:color="9AA5B1"/>
-              <w:bottom w:val="single" w:sz="4" w:space="0" w:color="9AA5B1"/>
-              <w:right w:val="single" w:sz="4" w:space="0" w:color="9AA5B1"/>
-            </w:tcBorders>
-            <w:tcMar>
-              <w:top w:w="50" w:type="dxa"/>
-              <w:left w:w="80" w:type="dxa"/>
-              <w:bottom w:w="50" w:type="dxa"/>
-              <w:right w:w="80" w:type="dxa"/>
-            </w:tcMar>
-          </w:tcPr>
-          <w:p>
-            <w:pPr>
-              <w:spacing w:after="30"/>
-            </w:pPr>
-            <w:r>
-              <w:rPr>
-                <w:sz w:val="17"/>
-                <w:szCs w:val="17"/>
-                <w:highlight w:val="yellow"/>
-              </w:rPr>
-              <w:t>«list»</w:t>
-            </w:r>
-          </w:p>
-        </w:tc>
-      </w:tr>
-      <w:tr>
-        <w:tblPrEx>
-          <w:tblCellMar>
-            <w:top w:w="0" w:type="dxa"/>
-            <w:bottom w:w="0" w:type="dxa"/>
-          </w:tblCellMar>
-        </w:tblPrEx>
-        <w:trPr>
-          <w:cantSplit/>
-        </w:trPr>
-        <w:tc>
-          <w:tcPr>
-            <w:tcW w:w="3000" w:type="dxa"/>
-            <w:tcBorders>
-              <w:top w:val="single" w:sz="4" w:space="0" w:color="9AA5B1"/>
-              <w:left w:val="single" w:sz="4" w:space="0" w:color="9AA5B1"/>
-              <w:bottom w:val="single" w:sz="4" w:space="0" w:color="9AA5B1"/>
-              <w:right w:val="single" w:sz="4" w:space="0" w:color="9AA5B1"/>
-            </w:tcBorders>
-            <w:tcMar>
-              <w:top w:w="50" w:type="dxa"/>
-              <w:left w:w="80" w:type="dxa"/>
-              <w:bottom w:w="50" w:type="dxa"/>
-              <w:right w:w="80" w:type="dxa"/>
-            </w:tcMar>
-          </w:tcPr>
-          <w:p>
-            <w:pPr>
-              <w:spacing w:after="30"/>
-            </w:pPr>
-            <w:proofErr w:type="spellStart"/>
-            <w:r>
-              <w:rPr>
-                <w:sz w:val="17"/>
-                <w:szCs w:val="17"/>
-              </w:rPr>
-              <w:t>Riegardt</w:t>
-            </w:r>
-            <w:proofErr w:type="spellEnd"/>
-            <w:r>
-              <w:rPr>
-                <w:sz w:val="17"/>
-                <w:szCs w:val="17"/>
-              </w:rPr>
-              <w:t xml:space="preserve"> Weich (</w:t>
-            </w:r>
-            <w:proofErr w:type="spellStart"/>
-            <w:r>
-              <w:rPr>
-                <w:sz w:val="17"/>
-                <w:szCs w:val="17"/>
-              </w:rPr>
-              <w:t>xStoffer</w:t>
-            </w:r>
-            <w:proofErr w:type="spellEnd"/>
-            <w:r>
-              <w:rPr>
-                <w:sz w:val="17"/>
-                <w:szCs w:val="17"/>
-              </w:rPr>
-              <w:t>)</w:t>
-            </w:r>
-          </w:p>
-        </w:tc>
-        <w:tc>
-          <w:tcPr>
-            <w:tcW w:w="2000" w:type="dxa"/>
-            <w:tcBorders>
-              <w:top w:val="single" w:sz="4" w:space="0" w:color="9AA5B1"/>
-              <w:left w:val="single" w:sz="4" w:space="0" w:color="9AA5B1"/>
-              <w:bottom w:val="single" w:sz="4" w:space="0" w:color="9AA5B1"/>
-              <w:right w:val="single" w:sz="4" w:space="0" w:color="9AA5B1"/>
-            </w:tcBorders>
-            <w:tcMar>
-              <w:top w:w="50" w:type="dxa"/>
-              <w:left w:w="80" w:type="dxa"/>
-              <w:bottom w:w="50" w:type="dxa"/>
-              <w:right w:w="80" w:type="dxa"/>
-            </w:tcMar>
-          </w:tcPr>
-          <w:p>
-            <w:pPr>
-              <w:spacing w:after="30"/>
-            </w:pPr>
-            <w:r>
-              <w:rPr>
-                <w:sz w:val="17"/>
-                <w:szCs w:val="17"/>
-                <w:highlight w:val="yellow"/>
-              </w:rPr>
-              <w:t>«#»</w:t>
-            </w:r>
-          </w:p>
-        </w:tc>
-        <w:tc>
-          <w:tcPr>
-            <w:tcW w:w="2000" w:type="dxa"/>
-            <w:tcBorders>
-              <w:top w:val="single" w:sz="4" w:space="0" w:color="9AA5B1"/>
-              <w:left w:val="single" w:sz="4" w:space="0" w:color="9AA5B1"/>
-              <w:bottom w:val="single" w:sz="4" w:space="0" w:color="9AA5B1"/>
-              <w:right w:val="single" w:sz="4" w:space="0" w:color="9AA5B1"/>
-            </w:tcBorders>
-            <w:tcMar>
-              <w:top w:w="50" w:type="dxa"/>
-              <w:left w:w="80" w:type="dxa"/>
-              <w:bottom w:w="50" w:type="dxa"/>
-              <w:right w:w="80" w:type="dxa"/>
-            </w:tcMar>
-          </w:tcPr>
-          <w:p>
-            <w:pPr>
-              <w:spacing w:after="30"/>
-            </w:pPr>
-            <w:r>
-              <w:rPr>
-                <w:sz w:val="17"/>
-                <w:szCs w:val="17"/>
-                <w:highlight w:val="yellow"/>
-              </w:rPr>
-              <w:t>«#»</w:t>
-            </w:r>
-          </w:p>
-        </w:tc>
-        <w:tc>
-          <w:tcPr>
-            <w:tcW w:w="2906" w:type="dxa"/>
-            <w:tcBorders>
-              <w:top w:val="single" w:sz="4" w:space="0" w:color="9AA5B1"/>
-              <w:left w:val="single" w:sz="4" w:space="0" w:color="9AA5B1"/>
-              <w:bottom w:val="single" w:sz="4" w:space="0" w:color="9AA5B1"/>
-              <w:right w:val="single" w:sz="4" w:space="0" w:color="9AA5B1"/>
-            </w:tcBorders>
-            <w:tcMar>
-              <w:top w:w="50" w:type="dxa"/>
-              <w:left w:w="80" w:type="dxa"/>
-              <w:bottom w:w="50" w:type="dxa"/>
-              <w:right w:w="80" w:type="dxa"/>
-            </w:tcMar>
-          </w:tcPr>
-          <w:p>
-            <w:pPr>
-              <w:spacing w:after="30"/>
-            </w:pPr>
-            <w:r>
-              <w:rPr>
-                <w:sz w:val="17"/>
-                <w:szCs w:val="17"/>
-                <w:highlight w:val="yellow"/>
-              </w:rPr>
-              <w:t>«list»</w:t>
-            </w:r>
-          </w:p>
-        </w:tc>
-      </w:tr>
-      <w:tr>
-        <w:tblPrEx>
-          <w:tblCellMar>
-            <w:top w:w="0" w:type="dxa"/>
-            <w:bottom w:w="0" w:type="dxa"/>
-          </w:tblCellMar>
-        </w:tblPrEx>
-        <w:trPr>
-          <w:cantSplit/>
-        </w:trPr>
-        <w:tc>
-          <w:tcPr>
-            <w:tcW w:w="3000" w:type="dxa"/>
-            <w:tcBorders>
-              <w:top w:val="single" w:sz="4" w:space="0" w:color="9AA5B1"/>
-              <w:left w:val="single" w:sz="4" w:space="0" w:color="9AA5B1"/>
-              <w:bottom w:val="single" w:sz="4" w:space="0" w:color="9AA5B1"/>
-              <w:right w:val="single" w:sz="4" w:space="0" w:color="9AA5B1"/>
-            </w:tcBorders>
-            <w:tcMar>
-              <w:top w:w="50" w:type="dxa"/>
-              <w:left w:w="80" w:type="dxa"/>
-              <w:bottom w:w="50" w:type="dxa"/>
-              <w:right w:w="80" w:type="dxa"/>
-            </w:tcMar>
-          </w:tcPr>
-          <w:p>
-            <w:pPr>
-              <w:spacing w:after="30"/>
-            </w:pPr>
-            <w:proofErr w:type="spellStart"/>
-            <w:r>
-              <w:rPr>
-                <w:sz w:val="17"/>
-                <w:szCs w:val="17"/>
-              </w:rPr>
-              <w:t>Ditheto</w:t>
-            </w:r>
-            <w:proofErr w:type="spellEnd"/>
-            <w:r>
-              <w:rPr>
-                <w:sz w:val="17"/>
-                <w:szCs w:val="17"/>
-              </w:rPr>
-              <w:t xml:space="preserve"> </w:t>
-            </w:r>
-            <w:proofErr w:type="spellStart"/>
-            <w:r>
-              <w:rPr>
-                <w:sz w:val="17"/>
-                <w:szCs w:val="17"/>
-              </w:rPr>
-              <w:t>Phaho</w:t>
-            </w:r>
-            <w:proofErr w:type="spellEnd"/>
-            <w:r>
-              <w:rPr>
-                <w:sz w:val="17"/>
-                <w:szCs w:val="17"/>
-              </w:rPr>
-              <w:t xml:space="preserve"> (Deee-dot)</w:t>
-            </w:r>
-          </w:p>
-        </w:tc>
-        <w:tc>
-          <w:tcPr>
-            <w:tcW w:w="2000" w:type="dxa"/>
-            <w:tcBorders>
-              <w:top w:val="single" w:sz="4" w:space="0" w:color="9AA5B1"/>
-              <w:left w:val="single" w:sz="4" w:space="0" w:color="9AA5B1"/>
-              <w:bottom w:val="single" w:sz="4" w:space="0" w:color="9AA5B1"/>
-              <w:right w:val="single" w:sz="4" w:space="0" w:color="9AA5B1"/>
-            </w:tcBorders>
-            <w:tcMar>
-              <w:top w:w="50" w:type="dxa"/>
-              <w:left w:w="80" w:type="dxa"/>
-              <w:bottom w:w="50" w:type="dxa"/>
-              <w:right w:w="80" w:type="dxa"/>
-            </w:tcMar>
-          </w:tcPr>
-          <w:p>
-            <w:pPr>
-              <w:spacing w:after="30"/>
-            </w:pPr>
-            <w:r>
-              <w:rPr>
-                <w:sz w:val="17"/>
-                <w:szCs w:val="17"/>
-                <w:highlight w:val="yellow"/>
-              </w:rPr>
-              <w:t>«#»</w:t>
-            </w:r>
-          </w:p>
-        </w:tc>
-        <w:tc>
-          <w:tcPr>
-            <w:tcW w:w="2000" w:type="dxa"/>
-            <w:tcBorders>
-              <w:top w:val="single" w:sz="4" w:space="0" w:color="9AA5B1"/>
-              <w:left w:val="single" w:sz="4" w:space="0" w:color="9AA5B1"/>
-              <w:bottom w:val="single" w:sz="4" w:space="0" w:color="9AA5B1"/>
-              <w:right w:val="single" w:sz="4" w:space="0" w:color="9AA5B1"/>
-            </w:tcBorders>
-            <w:tcMar>
-              <w:top w:w="50" w:type="dxa"/>
-              <w:left w:w="80" w:type="dxa"/>
-              <w:bottom w:w="50" w:type="dxa"/>
-              <w:right w:w="80" w:type="dxa"/>
-            </w:tcMar>
-          </w:tcPr>
-          <w:p>
-            <w:pPr>
-              <w:spacing w:after="30"/>
-            </w:pPr>
-            <w:r>
-              <w:rPr>
-                <w:sz w:val="17"/>
-                <w:szCs w:val="17"/>
-                <w:highlight w:val="yellow"/>
-              </w:rPr>
-              <w:t>«#»</w:t>
-            </w:r>
-          </w:p>
-        </w:tc>
-        <w:tc>
-          <w:tcPr>
-            <w:tcW w:w="2906" w:type="dxa"/>
-            <w:tcBorders>
-              <w:top w:val="single" w:sz="4" w:space="0" w:color="9AA5B1"/>
-              <w:left w:val="single" w:sz="4" w:space="0" w:color="9AA5B1"/>
-              <w:bottom w:val="single" w:sz="4" w:space="0" w:color="9AA5B1"/>
-              <w:right w:val="single" w:sz="4" w:space="0" w:color="9AA5B1"/>
-            </w:tcBorders>
-            <w:tcMar>
-              <w:top w:w="50" w:type="dxa"/>
-              <w:left w:w="80" w:type="dxa"/>
-              <w:bottom w:w="50" w:type="dxa"/>
-              <w:right w:w="80" w:type="dxa"/>
-            </w:tcMar>
-          </w:tcPr>
-          <w:p>
-            <w:pPr>
-              <w:spacing w:after="30"/>
-            </w:pPr>
-            <w:r>
-              <w:rPr>
-                <w:sz w:val="17"/>
-                <w:szCs w:val="17"/>
-                <w:highlight w:val="yellow"/>
-              </w:rPr>
-              <w:t>«list»</w:t>
-            </w:r>
-          </w:p>
-        </w:tc>
-      </w:tr>
-    </w:tbl>
     <w:p>
       <w:pPr>
         <w:spacing w:after="80"/>
       </w:pPr>
+      <w:r>
+        <w:drawing>
+          <wp:inline distT="0" distB="0" distL="0" distR="0" wp14:anchorId="379936F3" wp14:editId="7390F464">
+            <wp:extent cx="5322627" cy="3824060"/>
+            <wp:effectExtent l="0" t="0" r="0" b="5080"/>
+            <wp:docPr id="1582373764" name="Picture 1"/>
+            <wp:cNvGraphicFramePr>
+              <a:graphicFrameLocks xmlns:a="http://schemas.openxmlformats.org/drawingml/2006/main" noChangeAspect="1"/>
+            </wp:cNvGraphicFramePr>
+            <a:graphic xmlns:a="http://schemas.openxmlformats.org/drawingml/2006/main">
+              <a:graphicData uri="http://schemas.openxmlformats.org/drawingml/2006/picture">
+                <pic:pic xmlns:pic="http://schemas.openxmlformats.org/drawingml/2006/picture">
+                  <pic:nvPicPr>
+                    <pic:cNvPr id="1582373764" name=""/>
+                    <pic:cNvPicPr/>
+                  </pic:nvPicPr>
+                  <pic:blipFill>
+                    <a:blip r:embed="rId10"/>
+                    <a:stretch>
+                      <a:fillRect/>
+                    </a:stretch>
+                  </pic:blipFill>
+                  <pic:spPr>
+                    <a:xfrm>
+                      <a:off x="0" y="0"/>
+                      <a:ext cx="5347614" cy="3842012"/>
+                    </a:xfrm>
+                    <a:prstGeom prst="rect">
+                      <a:avLst/>
+                    </a:prstGeom>
+                  </pic:spPr>
+                </pic:pic>
+              </a:graphicData>
+            </a:graphic>
+          </wp:inline>
+        </w:drawing>
+      </w:r>
     </w:p>
     <w:p>
       <w:pPr>
@@ -14964,6 +14367,7 @@
                 <w:sz w:val="17"/>
                 <w:szCs w:val="17"/>
               </w:rPr>
+              <w:lastRenderedPageBreak/>
               <w:t>FR-005</w:t>
             </w:r>
           </w:p>
@@ -17179,7 +16583,6 @@
                 <w:sz w:val="17"/>
                 <w:szCs w:val="17"/>
               </w:rPr>
-              <w:lastRenderedPageBreak/>
               <w:t>FR-016</w:t>
             </w:r>
           </w:p>
@@ -19138,16 +18541,18 @@
           <w:p>
             <w:pPr>
               <w:spacing w:after="30"/>
-            </w:pPr>
-            <w:r>
               <w:rPr>
                 <w:b/>
                 <w:bCs/>
                 <w:sz w:val="17"/>
                 <w:szCs w:val="17"/>
               </w:rPr>
-              <w:t>ASR / constraint</w:t>
-            </w:r>
+            </w:pPr>
+          </w:p>
+          <w:p>
+            <w:pPr>
+              <w:spacing w:after="30"/>
+            </w:pPr>
           </w:p>
         </w:tc>
         <w:tc>
@@ -19218,6 +18623,7 @@
                 <w:sz w:val="17"/>
                 <w:szCs w:val="17"/>
               </w:rPr>
+              <w:lastRenderedPageBreak/>
               <w:t>Architecture responsibility</w:t>
             </w:r>
           </w:p>
@@ -19338,14 +18744,6 @@
               </w:rPr>
               <w:t xml:space="preserve"> written in the same transaction (ADR-004) and a version field on the request for optimistic concurrency. </w:t>
             </w:r>
-            <w:r>
-              <w:rPr>
-                <w:sz w:val="17"/>
-                <w:szCs w:val="17"/>
-                <w:highlight w:val="yellow"/>
-              </w:rPr>
-              <w:t>«Person 2: ERD and persistence ADR ref»</w:t>
-            </w:r>
           </w:p>
         </w:tc>
       </w:tr>
@@ -19520,16 +18918,15 @@
               <w:rPr>
                 <w:sz w:val="17"/>
                 <w:szCs w:val="17"/>
-                <w:highlight w:val="yellow"/>
-              </w:rPr>
-              <w:t>«Person 2: stack ADR ref»</w:t>
-            </w:r>
-            <w:r>
-              <w:rPr>
-                <w:sz w:val="17"/>
-                <w:szCs w:val="17"/>
-              </w:rPr>
-              <w:t>; ADR-008 for the automated check that runs the tests.</w:t>
+              </w:rPr>
+              <w:t>React Frontend, ASP.NET C# backend. PostgreSQL database.</w:t>
+            </w:r>
+            <w:r>
+              <w:rPr>
+                <w:sz w:val="17"/>
+                <w:szCs w:val="17"/>
+              </w:rPr>
+              <w:t xml:space="preserve"> ADR-008 for the automated check that runs the tests.</w:t>
             </w:r>
           </w:p>
         </w:tc>
@@ -19572,7 +18969,7 @@
                 <w:sz w:val="17"/>
                 <w:szCs w:val="17"/>
               </w:rPr>
-              <w:t>Application artefact</w:t>
+              <w:t>Initial verification</w:t>
             </w:r>
           </w:p>
         </w:tc>
@@ -19600,125 +18997,8 @@
               <w:rPr>
                 <w:sz w:val="17"/>
                 <w:szCs w:val="17"/>
-                <w:highlight w:val="yellow"/>
-              </w:rPr>
-              <w:t xml:space="preserve">«Branch, PR and files: </w:t>
-            </w:r>
-            <w:proofErr w:type="spellStart"/>
-            <w:r>
-              <w:rPr>
-                <w:sz w:val="17"/>
-                <w:szCs w:val="17"/>
-                <w:highlight w:val="yellow"/>
-              </w:rPr>
-              <w:t>RequestState</w:t>
-            </w:r>
-            <w:proofErr w:type="spellEnd"/>
-            <w:r>
-              <w:rPr>
-                <w:sz w:val="17"/>
-                <w:szCs w:val="17"/>
-                <w:highlight w:val="yellow"/>
-              </w:rPr>
-              <w:t xml:space="preserve"> classes, transitions handler, </w:t>
-            </w:r>
-            <w:proofErr w:type="spellStart"/>
-            <w:r>
-              <w:rPr>
-                <w:sz w:val="17"/>
-                <w:szCs w:val="17"/>
-                <w:highlight w:val="yellow"/>
-              </w:rPr>
-              <w:t>StatusHistory</w:t>
-            </w:r>
-            <w:proofErr w:type="spellEnd"/>
-            <w:r>
-              <w:rPr>
-                <w:sz w:val="17"/>
-                <w:szCs w:val="17"/>
-                <w:highlight w:val="yellow"/>
-              </w:rPr>
-              <w:t xml:space="preserve"> migration»</w:t>
-            </w:r>
-          </w:p>
-        </w:tc>
-      </w:tr>
-      <w:tr>
-        <w:tblPrEx>
-          <w:tblCellMar>
-            <w:top w:w="0" w:type="dxa"/>
-            <w:bottom w:w="0" w:type="dxa"/>
-          </w:tblCellMar>
-        </w:tblPrEx>
-        <w:trPr>
-          <w:cantSplit/>
-        </w:trPr>
-        <w:tc>
-          <w:tcPr>
-            <w:tcW w:w="2200" w:type="dxa"/>
-            <w:tcBorders>
-              <w:top w:val="single" w:sz="4" w:space="0" w:color="9AA5B1"/>
-              <w:left w:val="single" w:sz="4" w:space="0" w:color="9AA5B1"/>
-              <w:bottom w:val="single" w:sz="4" w:space="0" w:color="9AA5B1"/>
-              <w:right w:val="single" w:sz="4" w:space="0" w:color="9AA5B1"/>
-            </w:tcBorders>
-            <w:shd w:val="clear" w:color="auto" w:fill="EAF1FB"/>
-            <w:tcMar>
-              <w:top w:w="50" w:type="dxa"/>
-              <w:left w:w="80" w:type="dxa"/>
-              <w:bottom w:w="50" w:type="dxa"/>
-              <w:right w:w="80" w:type="dxa"/>
-            </w:tcMar>
-          </w:tcPr>
-          <w:p>
-            <w:pPr>
-              <w:spacing w:after="30"/>
-            </w:pPr>
-            <w:r>
-              <w:rPr>
-                <w:b/>
-                <w:bCs/>
-                <w:sz w:val="17"/>
-                <w:szCs w:val="17"/>
-              </w:rPr>
-              <w:t>Initial verification</w:t>
-            </w:r>
-          </w:p>
-        </w:tc>
-        <w:tc>
-          <w:tcPr>
-            <w:tcW w:w="7706" w:type="dxa"/>
-            <w:tcBorders>
-              <w:top w:val="single" w:sz="4" w:space="0" w:color="9AA5B1"/>
-              <w:left w:val="single" w:sz="4" w:space="0" w:color="9AA5B1"/>
-              <w:bottom w:val="single" w:sz="4" w:space="0" w:color="9AA5B1"/>
-              <w:right w:val="single" w:sz="4" w:space="0" w:color="9AA5B1"/>
-            </w:tcBorders>
-            <w:tcMar>
-              <w:top w:w="50" w:type="dxa"/>
-              <w:left w:w="80" w:type="dxa"/>
-              <w:bottom w:w="50" w:type="dxa"/>
-              <w:right w:w="80" w:type="dxa"/>
-            </w:tcMar>
-          </w:tcPr>
-          <w:p>
-            <w:pPr>
-              <w:spacing w:after="30"/>
-            </w:pPr>
-            <w:r>
-              <w:rPr>
-                <w:sz w:val="17"/>
-                <w:szCs w:val="17"/>
               </w:rPr>
               <w:t xml:space="preserve">VT-011: all 7 legal transitions accepted for an authorised actor; the other 29 ordered pairs rejected; requester and unassigned staff refused; exactly one history row per accepted transition and none for a rejected one. </w:t>
-            </w:r>
-            <w:r>
-              <w:rPr>
-                <w:sz w:val="17"/>
-                <w:szCs w:val="17"/>
-                <w:highlight w:val="yellow"/>
-              </w:rPr>
-              <w:t>«Test file and CI run link»</w:t>
             </w:r>
           </w:p>
         </w:tc>
@@ -20088,32 +19368,6 @@
               </w:rPr>
               <w:t xml:space="preserve"> updates RTM and this register. </w:t>
             </w:r>
-            <w:r>
-              <w:rPr>
-                <w:sz w:val="17"/>
-                <w:szCs w:val="17"/>
-                <w:highlight w:val="yellow"/>
-              </w:rPr>
-              <w:t>«</w:t>
-            </w:r>
-            <w:proofErr w:type="gramStart"/>
-            <w:r>
-              <w:rPr>
-                <w:sz w:val="17"/>
-                <w:szCs w:val="17"/>
-                <w:highlight w:val="yellow"/>
-              </w:rPr>
-              <w:t>confirm</w:t>
-            </w:r>
-            <w:proofErr w:type="gramEnd"/>
-            <w:r>
-              <w:rPr>
-                <w:sz w:val="17"/>
-                <w:szCs w:val="17"/>
-                <w:highlight w:val="yellow"/>
-              </w:rPr>
-              <w:t xml:space="preserve"> no other requirement changed»</w:t>
-            </w:r>
           </w:p>
         </w:tc>
         <w:tc>
@@ -20181,7 +19435,6 @@
                 <w:sz w:val="17"/>
                 <w:szCs w:val="17"/>
               </w:rPr>
-              <w:lastRenderedPageBreak/>
               <w:t>R2</w:t>
             </w:r>
           </w:p>
@@ -20269,15 +19522,14 @@
                 <w:sz w:val="17"/>
                 <w:szCs w:val="17"/>
               </w:rPr>
-              <w:t xml:space="preserve">Conventions in D.1 tighten branch and commit practice; conflicts to date: </w:t>
-            </w:r>
-            <w:r>
-              <w:rPr>
-                <w:sz w:val="17"/>
-                <w:szCs w:val="17"/>
-                <w:highlight w:val="yellow"/>
-              </w:rPr>
-              <w:t>«none / list»</w:t>
+              <w:t>Conventions in D.1 tighten branch and commit practice; conflicts to date</w:t>
+            </w:r>
+            <w:r>
+              <w:rPr>
+                <w:sz w:val="17"/>
+                <w:szCs w:val="17"/>
+              </w:rPr>
+              <w:t>.</w:t>
             </w:r>
           </w:p>
         </w:tc>
@@ -22096,6 +21348,7 @@
                 <w:sz w:val="17"/>
                 <w:szCs w:val="17"/>
               </w:rPr>
+              <w:lastRenderedPageBreak/>
               <w:t>R9</w:t>
             </w:r>
           </w:p>
@@ -23262,7 +22515,6 @@
                 <w:sz w:val="17"/>
                 <w:szCs w:val="17"/>
               </w:rPr>
-              <w:lastRenderedPageBreak/>
               <w:t>R12</w:t>
             </w:r>
           </w:p>
@@ -26207,7 +25459,6 @@
                 <w:sz w:val="17"/>
                 <w:szCs w:val="17"/>
               </w:rPr>
-              <w:lastRenderedPageBreak/>
               <w:t>30 September</w:t>
             </w:r>
           </w:p>
@@ -27338,13 +26589,15 @@
             <w:pPr>
               <w:spacing w:after="30"/>
             </w:pPr>
-            <w:r>
-              <w:rPr>
-                <w:sz w:val="17"/>
-                <w:szCs w:val="17"/>
-              </w:rPr>
-              <w:t>Person 1</w:t>
-            </w:r>
+            <w:proofErr w:type="spellStart"/>
+            <w:r>
+              <w:rPr>
+                <w:sz w:val="17"/>
+                <w:szCs w:val="17"/>
+              </w:rPr>
+              <w:t>Riegardt</w:t>
+            </w:r>
+            <w:proofErr w:type="spellEnd"/>
           </w:p>
         </w:tc>
         <w:tc>
@@ -27372,7 +26625,7 @@
                 <w:sz w:val="17"/>
                 <w:szCs w:val="17"/>
               </w:rPr>
-              <w:t>M1 review findings logged as CR-001 to CR-003 (as in Person 1’s draft)</w:t>
+              <w:t>M1 review findings logged as CR-001 to CR-003</w:t>
             </w:r>
           </w:p>
         </w:tc>
@@ -27412,7 +26665,14 @@
                 <w:sz w:val="17"/>
                 <w:szCs w:val="17"/>
               </w:rPr>
-              <w:t>1.2</w:t>
+              <w:t>1.</w:t>
+            </w:r>
+            <w:r>
+              <w:rPr>
+                <w:sz w:val="17"/>
+                <w:szCs w:val="17"/>
+              </w:rPr>
+              <w:t>8</w:t>
             </w:r>
           </w:p>
         </w:tc>
@@ -27464,14 +26724,27 @@
           <w:p>
             <w:pPr>
               <w:spacing w:after="30"/>
-            </w:pPr>
-            <w:r>
-              <w:rPr>
-                <w:sz w:val="17"/>
-                <w:szCs w:val="17"/>
-              </w:rPr>
-              <w:t>Person 3</w:t>
-            </w:r>
+              <w:rPr>
+                <w:sz w:val="17"/>
+                <w:szCs w:val="17"/>
+              </w:rPr>
+            </w:pPr>
+            <w:r>
+              <w:rPr>
+                <w:sz w:val="17"/>
+                <w:szCs w:val="17"/>
+              </w:rPr>
+              <w:t xml:space="preserve">Armand and </w:t>
+            </w:r>
+            <w:proofErr w:type="spellStart"/>
+            <w:r>
+              <w:rPr>
+                <w:sz w:val="17"/>
+                <w:szCs w:val="17"/>
+              </w:rPr>
+              <w:t>Ditheto</w:t>
+            </w:r>
+            <w:proofErr w:type="spellEnd"/>
           </w:p>
         </w:tc>
         <w:tc>
@@ -27499,15 +26772,7 @@
                 <w:sz w:val="17"/>
                 <w:szCs w:val="17"/>
               </w:rPr>
-              <w:t xml:space="preserve">Design problems, ADR-005 to ADR-008, interface decisions, RTM design/implementation/verification columns, risks R10–R18 and merge of R5–R9, AI Register, governance updates, citations. </w:t>
-            </w:r>
-            <w:r>
-              <w:rPr>
-                <w:sz w:val="17"/>
-                <w:szCs w:val="17"/>
-                <w:highlight w:val="yellow"/>
-              </w:rPr>
-              <w:t>«Renumber if Person 2 merges first»</w:t>
+              <w:t>Design problems, ADR-005 to ADR-008, interface decisions, RTM design/implementation/verification columns, risks R10–R18 and merge of R5–R9, AI Register, governance updates, citations.</w:t>
             </w:r>
           </w:p>
         </w:tc>
@@ -27541,6 +26806,10 @@
           <w:p>
             <w:pPr>
               <w:spacing w:after="30"/>
+              <w:rPr>
+                <w:sz w:val="17"/>
+                <w:szCs w:val="17"/>
+              </w:rPr>
             </w:pPr>
             <w:r>
               <w:rPr>
@@ -27570,14 +26839,17 @@
           <w:p>
             <w:pPr>
               <w:spacing w:after="30"/>
-            </w:pPr>
-            <w:r>
-              <w:rPr>
-                <w:sz w:val="17"/>
-                <w:szCs w:val="17"/>
-                <w:highlight w:val="yellow"/>
-              </w:rPr>
-              <w:t>«date»</w:t>
+              <w:rPr>
+                <w:sz w:val="17"/>
+                <w:szCs w:val="17"/>
+              </w:rPr>
+            </w:pPr>
+            <w:r>
+              <w:rPr>
+                <w:sz w:val="17"/>
+                <w:szCs w:val="17"/>
+              </w:rPr>
+              <w:t>30 September</w:t>
             </w:r>
           </w:p>
         </w:tc>
@@ -27716,6 +26988,7 @@
                 <w:sz w:val="17"/>
                 <w:szCs w:val="17"/>
               </w:rPr>
+              <w:lastRenderedPageBreak/>
               <w:t>ID</w:t>
             </w:r>
           </w:p>
@@ -28040,15 +27313,7 @@
                 <w:sz w:val="17"/>
                 <w:szCs w:val="17"/>
               </w:rPr>
-              <w:t xml:space="preserve">Deferred in M1; </w:t>
-            </w:r>
-            <w:r>
-              <w:rPr>
-                <w:sz w:val="17"/>
-                <w:szCs w:val="17"/>
-                <w:highlight w:val="yellow"/>
-              </w:rPr>
-              <w:t>«superseded by Person 2 ADR-__»</w:t>
+              <w:t>Accepted</w:t>
             </w:r>
           </w:p>
         </w:tc>
@@ -28077,7 +27342,7 @@
                 <w:sz w:val="17"/>
                 <w:szCs w:val="17"/>
               </w:rPr>
-              <w:t>Preserve original entry and reason</w:t>
+              <w:t>Evidence for team experience and collaboration</w:t>
             </w:r>
           </w:p>
         </w:tc>
@@ -28211,8 +27476,25 @@
               <w:rPr>
                 <w:sz w:val="17"/>
                 <w:szCs w:val="17"/>
-              </w:rPr>
-              <w:t>Preserve original entry and reason</w:t>
+                <w:highlight w:val="yellow"/>
+              </w:rPr>
+              <w:t>«</w:t>
+            </w:r>
+            <w:r>
+              <w:rPr>
+                <w:sz w:val="17"/>
+                <w:szCs w:val="17"/>
+                <w:highlight w:val="yellow"/>
+              </w:rPr>
+              <w:t>Person 2 entry</w:t>
+            </w:r>
+            <w:r>
+              <w:rPr>
+                <w:sz w:val="17"/>
+                <w:szCs w:val="17"/>
+                <w:highlight w:val="yellow"/>
+              </w:rPr>
+              <w:t>»</w:t>
             </w:r>
           </w:p>
         </w:tc>
@@ -28565,6 +27847,13 @@
                 <w:szCs w:val="17"/>
               </w:rPr>
               <w:t>Proposed</w:t>
+            </w:r>
+            <w:r>
+              <w:rPr>
+                <w:sz w:val="17"/>
+                <w:szCs w:val="17"/>
+              </w:rPr>
+              <w:t>/</w:t>
             </w:r>
           </w:p>
         </w:tc>
@@ -29069,7 +28358,6 @@
                 <w:sz w:val="17"/>
                 <w:szCs w:val="17"/>
               </w:rPr>
-              <w:lastRenderedPageBreak/>
               <w:t>Deferred decision</w:t>
             </w:r>
           </w:p>
@@ -29898,6 +29186,9 @@
             <w:pPr>
               <w:spacing w:after="30"/>
             </w:pPr>
+            <w:r>
+              <w:t>30 September</w:t>
+            </w:r>
           </w:p>
         </w:tc>
       </w:tr>
@@ -29931,14 +29222,31 @@
             <w:pPr>
               <w:spacing w:after="30"/>
             </w:pPr>
-            <w:r>
-              <w:rPr>
-                <w:sz w:val="17"/>
-                <w:szCs w:val="17"/>
-                <w:highlight w:val="yellow"/>
-              </w:rPr>
-              <w:t>«Person 2»</w:t>
-            </w:r>
+            <w:proofErr w:type="spellStart"/>
+            <w:r>
+              <w:rPr>
+                <w:sz w:val="17"/>
+                <w:szCs w:val="17"/>
+              </w:rPr>
+              <w:t>Ditheto</w:t>
+            </w:r>
+            <w:proofErr w:type="spellEnd"/>
+            <w:r>
+              <w:rPr>
+                <w:sz w:val="17"/>
+                <w:szCs w:val="17"/>
+              </w:rPr>
+              <w:t xml:space="preserve"> Lesiba </w:t>
+            </w:r>
+            <w:proofErr w:type="spellStart"/>
+            <w:r>
+              <w:rPr>
+                <w:sz w:val="17"/>
+                <w:szCs w:val="17"/>
+              </w:rPr>
+              <w:t>Phaho</w:t>
+            </w:r>
+            <w:proofErr w:type="spellEnd"/>
           </w:p>
         </w:tc>
         <w:tc>
@@ -30012,6 +29320,9 @@
             <w:pPr>
               <w:spacing w:after="30"/>
             </w:pPr>
+            <w:r>
+              <w:t>30 September</w:t>
+            </w:r>
           </w:p>
         </w:tc>
       </w:tr>
@@ -30049,9 +29360,8 @@
               <w:rPr>
                 <w:sz w:val="17"/>
                 <w:szCs w:val="17"/>
-                <w:highlight w:val="yellow"/>
-              </w:rPr>
-              <w:t>«Person 3»</w:t>
+              </w:rPr>
+              <w:t>Armand Vermeulen</w:t>
             </w:r>
           </w:p>
         </w:tc>
@@ -30104,6 +29414,71 @@
             <w:pPr>
               <w:spacing w:after="30"/>
             </w:pPr>
+            <w:r>
+              <w:rPr>
+                <w:noProof/>
+                <w14:ligatures w14:val="standardContextual"/>
+              </w:rPr>
+              <mc:AlternateContent>
+                <mc:Choice Requires="wpi">
+                  <w:drawing>
+                    <wp:anchor distT="0" distB="0" distL="114300" distR="114300" simplePos="0" relativeHeight="251659264" behindDoc="0" locked="0" layoutInCell="1" allowOverlap="1" wp14:anchorId="41EABB67" wp14:editId="17E74731">
+                      <wp:simplePos x="0" y="0"/>
+                      <wp:positionH relativeFrom="column">
+                        <wp:posOffset>257402</wp:posOffset>
+                      </wp:positionH>
+                      <wp:positionV relativeFrom="paragraph">
+                        <wp:posOffset>10966</wp:posOffset>
+                      </wp:positionV>
+                      <wp:extent cx="488880" cy="171000"/>
+                      <wp:effectExtent l="38100" t="38100" r="6985" b="38735"/>
+                      <wp:wrapNone/>
+                      <wp:docPr id="358975280" name="Ink 25"/>
+                      <wp:cNvGraphicFramePr/>
+                      <a:graphic xmlns:a="http://schemas.openxmlformats.org/drawingml/2006/main">
+                        <a:graphicData uri="http://schemas.microsoft.com/office/word/2010/wordprocessingInk">
+                          <w14:contentPart bwMode="auto" r:id="rId11">
+                            <w14:nvContentPartPr>
+                              <w14:cNvContentPartPr/>
+                            </w14:nvContentPartPr>
+                            <w14:xfrm>
+                              <a:off x="0" y="0"/>
+                              <a:ext cx="488880" cy="171000"/>
+                            </w14:xfrm>
+                          </w14:contentPart>
+                        </a:graphicData>
+                      </a:graphic>
+                    </wp:anchor>
+                  </w:drawing>
+                </mc:Choice>
+                <mc:Fallback>
+                  <w:pict>
+                    <v:shapetype w14:anchorId="220E4F43" id="_x0000_t75" coordsize="21600,21600" o:spt="75" o:preferrelative="t" path="m@4@5l@4@11@9@11@9@5xe" filled="f" stroked="f">
+                      <v:stroke joinstyle="miter"/>
+                      <v:formulas>
+                        <v:f eqn="if lineDrawn pixelLineWidth 0"/>
+                        <v:f eqn="sum @0 1 0"/>
+                        <v:f eqn="sum 0 0 @1"/>
+                        <v:f eqn="prod @2 1 2"/>
+                        <v:f eqn="prod @3 21600 pixelWidth"/>
+                        <v:f eqn="prod @3 21600 pixelHeight"/>
+                        <v:f eqn="sum @0 0 1"/>
+                        <v:f eqn="prod @6 1 2"/>
+                        <v:f eqn="prod @7 21600 pixelWidth"/>
+                        <v:f eqn="sum @8 21600 0"/>
+                        <v:f eqn="prod @7 21600 pixelHeight"/>
+                        <v:f eqn="sum @10 21600 0"/>
+                      </v:formulas>
+                      <v:path o:extrusionok="f" gradientshapeok="t" o:connecttype="rect"/>
+                      <o:lock v:ext="edit" aspectratio="t"/>
+                    </v:shapetype>
+                    <v:shape id="Ink 25" o:spid="_x0000_s1026" type="#_x0000_t75" style="position:absolute;margin-left:19.75pt;margin-top:.35pt;width:39.5pt;height:14.45pt;z-index:251659264;visibility:visible;mso-wrap-style:square;mso-wrap-distance-left:9pt;mso-wrap-distance-top:0;mso-wrap-distance-right:9pt;mso-wrap-distance-bottom:0;mso-position-horizontal:absolute;mso-position-horizontal-relative:text;mso-position-vertical:absolute;mso-position-vertical-relative:text" o:gfxdata="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">
+                      <v:imagedata r:id="rId12" o:title=""/>
+                    </v:shape>
+                  </w:pict>
+                </mc:Fallback>
+              </mc:AlternateContent>
+            </w:r>
           </w:p>
         </w:tc>
         <w:tc>
@@ -30126,6 +29501,9 @@
             <w:pPr>
               <w:spacing w:after="30"/>
             </w:pPr>
+            <w:r>
+              <w:t>30 September</w:t>
+            </w:r>
           </w:p>
         </w:tc>
       </w:tr>
@@ -30134,130 +29512,6 @@
       <w:pPr>
         <w:spacing w:after="80"/>
       </w:pPr>
-    </w:p>
-    <w:p>
-      <w:pPr>
-        <w:pStyle w:val="Heading2"/>
-      </w:pPr>
-      <w:r>
-        <w:t>H.5 Defence preparation for Person 3 (4–</w:t>
-      </w:r>
-      <w:proofErr w:type="gramStart"/>
-      <w:r>
-        <w:t>5 minute</w:t>
-      </w:r>
-      <w:proofErr w:type="gramEnd"/>
-      <w:r>
-        <w:t xml:space="preserve"> segment)</w:t>
-      </w:r>
-    </w:p>
-    <w:p>
-      <w:pPr>
-        <w:pStyle w:val="ListParagraph"/>
-        <w:numPr>
-          <w:ilvl w:val="0"/>
-          <w:numId w:val="2"/>
-        </w:numPr>
-        <w:spacing w:after="60"/>
-      </w:pPr>
-      <w:r>
-        <w:t xml:space="preserve">Show one design decision end to end: A2 evidence → final judgement → ADR-006 → code </w:t>
-      </w:r>
-      <w:r>
-        <w:rPr>
-          <w:highlight w:val="yellow"/>
-        </w:rPr>
-        <w:t>«PR»</w:t>
-      </w:r>
-      <w:r>
-        <w:t xml:space="preserve"> → test VT-011.</w:t>
-      </w:r>
-    </w:p>
-    <w:p>
-      <w:pPr>
-        <w:pStyle w:val="ListParagraph"/>
-        <w:numPr>
-          <w:ilvl w:val="0"/>
-          <w:numId w:val="2"/>
-        </w:numPr>
-        <w:spacing w:after="60"/>
-      </w:pPr>
-      <w:r>
-        <w:t>Say what State and Observer cost (extra classes, indirection, synchronous latency) and what would change if reversed; each ADR has an “If reversed” row.</w:t>
-      </w:r>
-    </w:p>
-    <w:p>
-      <w:pPr>
-        <w:pStyle w:val="ListParagraph"/>
-        <w:numPr>
-          <w:ilvl w:val="0"/>
-          <w:numId w:val="2"/>
-        </w:numPr>
-        <w:spacing w:after="60"/>
-      </w:pPr>
-      <w:r>
-        <w:t>Explain how the design respects Person 1’s decisions: Identity &amp; Access decides who may act (ADR-003), the transaction rule comes from ADR-004, and Observer is how ADR-005 realises it.</w:t>
-      </w:r>
-    </w:p>
-    <w:p>
-      <w:pPr>
-        <w:pStyle w:val="ListParagraph"/>
-        <w:numPr>
-          <w:ilvl w:val="0"/>
-          <w:numId w:val="2"/>
-        </w:numPr>
-        <w:spacing w:after="60"/>
-      </w:pPr>
-      <w:r>
-        <w:t>Open the RTM live and show FR-011: which columns moved since M1 and why.</w:t>
-      </w:r>
-    </w:p>
-    <w:p>
-      <w:pPr>
-        <w:pStyle w:val="ListParagraph"/>
-        <w:numPr>
-          <w:ilvl w:val="0"/>
-          <w:numId w:val="2"/>
-        </w:numPr>
-        <w:spacing w:after="60"/>
-      </w:pPr>
-      <w:r>
-        <w:t>Show the README and how another developer runs it; point out project-specific code versus scaffolding.</w:t>
-      </w:r>
-    </w:p>
-    <w:p>
-      <w:pPr>
-        <w:pStyle w:val="ListParagraph"/>
-        <w:numPr>
-          <w:ilvl w:val="0"/>
-          <w:numId w:val="2"/>
-        </w:numPr>
-        <w:spacing w:after="60"/>
-      </w:pPr>
-      <w:r>
-        <w:t>State what AI drafted, what the team verified and where the register records it, including the source checks; state which CI recommendation was adopted (ADR-008</w:t>
-      </w:r>
-      <w:proofErr w:type="gramStart"/>
-      <w:r>
-        <w:t>)</w:t>
-      </w:r>
-      <w:proofErr w:type="gramEnd"/>
-      <w:r>
-        <w:t xml:space="preserve"> and which is deferred.</w:t>
-      </w:r>
-    </w:p>
-    <w:p>
-      <w:pPr>
-        <w:pStyle w:val="ListParagraph"/>
-        <w:numPr>
-          <w:ilvl w:val="0"/>
-          <w:numId w:val="2"/>
-        </w:numPr>
-        <w:spacing w:after="60"/>
-      </w:pPr>
-      <w:r>
-        <w:t>Name one deferred decision: asynchronous events (evidence needed: measured load or failures).</w:t>
-      </w:r>
     </w:p>
     <w:p>
       <w:pPr>
@@ -30289,6 +29543,7 @@
         <w:ind w:left="540" w:hanging="540"/>
       </w:pPr>
       <w:r>
+        <w:lastRenderedPageBreak/>
         <w:t xml:space="preserve">Bacchelli, A. and Bird, C. (2013) ‘Expectations, outcomes, and challenges of modern code review’, </w:t>
       </w:r>
       <w:r>
@@ -30321,10 +29576,7 @@
         <w:t xml:space="preserve">. Available at: https://cbea.ms/git-commit/ (Accessed: </w:t>
       </w:r>
       <w:r>
-        <w:rPr>
-          <w:highlight w:val="yellow"/>
-        </w:rPr>
-        <w:t>«date»</w:t>
+        <w:t>30 September 2026</w:t>
       </w:r>
       <w:r>
         <w:t>).</w:t>
@@ -30349,10 +29601,7 @@
         <w:t xml:space="preserve">. PhD dissertation. University of California, Irvine. Available at: https://ics.uci.edu/~fielding/pubs/dissertation/top.htm (Accessed: </w:t>
       </w:r>
       <w:r>
-        <w:rPr>
-          <w:highlight w:val="yellow"/>
-        </w:rPr>
-        <w:t>«date»</w:t>
+        <w:t>30 September 2026</w:t>
       </w:r>
       <w:r>
         <w:t>).</w:t>
@@ -30402,7 +29651,6 @@
         <w:ind w:left="540" w:hanging="540"/>
       </w:pPr>
       <w:r>
-        <w:lastRenderedPageBreak/>
         <w:t xml:space="preserve">Fowler, M. (2006) ‘Continuous integration’, </w:t>
       </w:r>
       <w:r>
@@ -30416,10 +29664,7 @@
         <w:t xml:space="preserve">, 1 May. Available at: https://martinfowler.com/articles/continuousIntegration.html (Accessed: </w:t>
       </w:r>
       <w:r>
-        <w:rPr>
-          <w:highlight w:val="yellow"/>
-        </w:rPr>
-        <w:t>«date»</w:t>
+        <w:t>30 September 2026</w:t>
       </w:r>
       <w:r>
         <w:t>).</w:t>
@@ -30452,10 +29697,7 @@
         <w:t xml:space="preserve">, 1 May. Available at: https://martinfowler.com/bliki/TestPyramid.html (Accessed: </w:t>
       </w:r>
       <w:r>
-        <w:rPr>
-          <w:highlight w:val="yellow"/>
-        </w:rPr>
-        <w:t>«date»</w:t>
+        <w:t>30 September 2026</w:t>
       </w:r>
       <w:r>
         <w:t>).</w:t>
@@ -30605,10 +29847,7 @@
         <w:t xml:space="preserve">. Available at: https://docs.github.com/en/actions (Accessed: </w:t>
       </w:r>
       <w:r>
-        <w:rPr>
-          <w:highlight w:val="yellow"/>
-        </w:rPr>
-        <w:t>«date»</w:t>
+        <w:t>30 September 2026</w:t>
       </w:r>
       <w:r>
         <w:t>).</w:t>
@@ -30685,10 +29924,7 @@
         <w:t xml:space="preserve">. Available at: https://spec.graphql.org/October2021/ (Accessed: </w:t>
       </w:r>
       <w:r>
-        <w:rPr>
-          <w:highlight w:val="yellow"/>
-        </w:rPr>
-        <w:t>«date»</w:t>
+        <w:t>30 September 2026</w:t>
       </w:r>
       <w:r>
         <w:t>).</w:t>
@@ -30865,10 +30101,7 @@
         <w:t xml:space="preserve">, 15 November. Available at: https://www.cognitect.com/blog/2011/11/15/documenting-architecture-decisions (Accessed: </w:t>
       </w:r>
       <w:r>
-        <w:rPr>
-          <w:highlight w:val="yellow"/>
-        </w:rPr>
-        <w:t>«date»</w:t>
+        <w:t>30 September 2026</w:t>
       </w:r>
       <w:r>
         <w:t>). (</w:t>
@@ -30915,10 +30148,7 @@
         <w:t xml:space="preserve">. Available at: https://spec.openapis.org/oas/v3.1.0 (Accessed: </w:t>
       </w:r>
       <w:r>
-        <w:rPr>
-          <w:highlight w:val="yellow"/>
-        </w:rPr>
-        <w:t>«date»</w:t>
+        <w:t>30 September 2026</w:t>
       </w:r>
       <w:r>
         <w:t>).</w:t>
@@ -30943,10 +30173,7 @@
         <w:t xml:space="preserve">. Available at: https://owasp.org/API-Security/editions/2023/en/0x11-t10/ (Accessed: </w:t>
       </w:r>
       <w:r>
-        <w:rPr>
-          <w:highlight w:val="yellow"/>
-        </w:rPr>
-        <w:t>«date»</w:t>
+        <w:t>30 September 2026</w:t>
       </w:r>
       <w:r>
         <w:t>).</w:t>
@@ -30958,6 +30185,7 @@
         <w:ind w:left="540" w:hanging="540"/>
       </w:pPr>
       <w:r>
+        <w:lastRenderedPageBreak/>
         <w:t>OWASP Foundation (</w:t>
       </w:r>
       <w:proofErr w:type="spellStart"/>
@@ -30979,10 +30207,7 @@
         <w:t xml:space="preserve">. Available at: https://cheatsheetseries.owasp.org/cheatsheets/Logging_Cheat_Sheet.html (Accessed: </w:t>
       </w:r>
       <w:r>
-        <w:rPr>
-          <w:highlight w:val="yellow"/>
-        </w:rPr>
-        <w:t>«date»</w:t>
+        <w:t>30 September 2026</w:t>
       </w:r>
       <w:r>
         <w:t>).</w:t>
@@ -31015,10 +30240,7 @@
         <w:t xml:space="preserve">. Available at: https://cheatsheetseries.owasp.org/cheatsheets/Secrets_Management_Cheat_Sheet.html (Accessed: </w:t>
       </w:r>
       <w:r>
-        <w:rPr>
-          <w:highlight w:val="yellow"/>
-        </w:rPr>
-        <w:t>«date»</w:t>
+        <w:t>30 September 2026</w:t>
       </w:r>
       <w:r>
         <w:t>).</w:t>
@@ -31043,10 +30265,7 @@
         <w:t xml:space="preserve">. Available at: https://12factor.net/ (Accessed: </w:t>
       </w:r>
       <w:r>
-        <w:rPr>
-          <w:highlight w:val="yellow"/>
-        </w:rPr>
-        <w:t>«date»</w:t>
+        <w:t>30 September 2026</w:t>
       </w:r>
       <w:r>
         <w:t>).</w:t>
@@ -31057,7 +30276,7 @@
         <w:pStyle w:val="Heading2"/>
       </w:pPr>
       <w:r>
-        <w:t>I.2 Verification status of these sources (be honest at the defence)</w:t>
+        <w:t>I.2 Verification status of these sources</w:t>
       </w:r>
     </w:p>
     <w:tbl>
@@ -31325,7 +30544,6 @@
                 <w:sz w:val="17"/>
                 <w:szCs w:val="17"/>
               </w:rPr>
-              <w:lastRenderedPageBreak/>
               <w:t xml:space="preserve">Books: Gamma et al.; Freeman and Robson; Fowler (2002); </w:t>
             </w:r>
             <w:proofErr w:type="spellStart"/>
@@ -31566,7 +30784,7 @@
       </w:r>
     </w:p>
     <w:sectPr>
-      <w:footerReference w:type="default" r:id="rId10"/>
+      <w:footerReference w:type="default" r:id="rId13"/>
       <w:pgSz w:w="11906" w:h="16838"/>
       <w:pgMar w:top="1000" w:right="1000" w:bottom="1000" w:left="1000" w:header="708" w:footer="708" w:gutter="0"/>
       <w:cols w:space="720"/>
@@ -32476,7 +31694,46 @@
     <w:uiPriority w:val="99"/>
     <w:rsid w:val="008D071B"/>
   </w:style>
+  <w:style w:type="character" w:styleId="UnresolvedMention">
+    <w:name w:val="Unresolved Mention"/>
+    <w:basedOn w:val="DefaultParagraphFont"/>
+    <w:uiPriority w:val="99"/>
+    <w:semiHidden/>
+    <w:unhideWhenUsed/>
+    <w:rsid w:val="00C82C37"/>
+    <w:rPr>
+      <w:color w:val="605E5C"/>
+      <w:shd w:val="clear" w:color="auto" w:fill="E1DFDD"/>
+    </w:rPr>
+  </w:style>
 </w:styles>
+</file>
+
+<file path=word/ink/ink1.xml><?xml version="1.0" encoding="utf-8"?>
+<inkml:ink xmlns:inkml="http://www.w3.org/2003/InkML">
+  <inkml:definitions>
+    <inkml:context xml:id="ctx0">
+      <inkml:inkSource xml:id="inkSrc0">
+        <inkml:traceFormat>
+          <inkml:channel name="X" type="integer" min="-2.14748E9" max="2.14748E9" units="cm"/>
+          <inkml:channel name="Y" type="integer" min="-2.14748E9" max="2.14748E9" units="cm"/>
+          <inkml:channel name="F" type="integer" max="32767" units="dev"/>
+        </inkml:traceFormat>
+        <inkml:channelProperties>
+          <inkml:channelProperty channel="X" name="resolution" value="1000" units="1/cm"/>
+          <inkml:channelProperty channel="Y" name="resolution" value="1000" units="1/cm"/>
+          <inkml:channelProperty channel="F" name="resolution" value="0" units="1/dev"/>
+        </inkml:channelProperties>
+      </inkml:inkSource>
+      <inkml:timestamp xml:id="ts0" timeString="2026-09-08T12:40:33.118"/>
+    </inkml:context>
+    <inkml:brush xml:id="br0">
+      <inkml:brushProperty name="width" value="0.035" units="cm"/>
+      <inkml:brushProperty name="height" value="0.035" units="cm"/>
+    </inkml:brush>
+  </inkml:definitions>
+  <inkml:trace contextRef="#ctx0" brushRef="#br0">99 128 24575,'-2'0'0,"-1"1"0,0 0 0,1 0 0,-1 0 0,1 0 0,-1 1 0,1-1 0,0 1 0,0-1 0,-1 1 0,1 0 0,0 0 0,0 0 0,1 0 0,-1 0 0,-2 4 0,-24 38 0,23-34 0,0 0 0,1 0 0,0 1 0,1 0 0,0-1 0,1 1 0,0 0 0,0 0 0,1 18 0,1-25 0,1 0 0,-1 0 0,1 0 0,0 0 0,0-1 0,0 1 0,1 0 0,-1-1 0,1 1 0,0-1 0,0 1 0,0-1 0,0 0 0,1 0 0,-1 0 0,1 0 0,0 0 0,0-1 0,0 1 0,0-1 0,0 0 0,0 0 0,1 0 0,-1 0 0,1-1 0,-1 1 0,1-1 0,0 0 0,0 0 0,0 0 0,3 0 0,3 1 0,1-1 0,-1 1 0,0-2 0,0 0 0,1 0 0,-1 0 0,0-2 0,0 1 0,16-5 0,-20 4 0,-1 0 0,0 0 0,-1 0 0,1-1 0,0 0 0,-1 0 0,1 0 0,-1 0 0,0-1 0,0 1 0,0-1 0,-1 0 0,1 0 0,-1-1 0,0 1 0,0-1 0,0 0 0,-1 1 0,4-10 0,8-34 0,9-52 0,-5 19 0,-14 61 0,-3 15 0,-1 0 0,1 0 0,0 1 0,0-1 0,0 1 0,1-1 0,-1 1 0,1-1 0,1 1 0,-1 0 0,0 0 0,1 0 0,0 0 0,0 0 0,6-6 0,-8 10 0,-1 0 0,0-1 0,1 1 0,-1 0 0,1 0 0,-1-1 0,1 1 0,-1 0 0,1 0 0,-1 0 0,1 0 0,-1 0 0,1-1 0,-1 1 0,1 0 0,-1 0 0,1 0 0,-1 0 0,1 1 0,-1-1 0,1 0 0,-1 0 0,1 0 0,-1 0 0,1 0 0,-1 1 0,0-1 0,1 0 0,-1 0 0,1 1 0,-1-1 0,0 0 0,1 1 0,-1-1 0,1 0 0,-1 1 0,9 24 0,-4 28 0,-5-52 0,-1 14 0,0 1 0,2-1 0,0 1 0,0-1 0,2 0 0,0 1 0,0-1 0,2 0 0,0-1 0,0 1 0,13 21 0,-3-10 0,-13-20 0,1 0 0,0 0 0,1-1 0,0 0 0,-1 1 0,2-2 0,5 7 0,-8-9 0,1 0 0,0-1 0,-1 0 0,1 1 0,0-1 0,0 0 0,0 0 0,0-1 0,0 1 0,0-1 0,0 1 0,0-1 0,0 0 0,0 0 0,0 0 0,0-1 0,0 1 0,0-1 0,0 1 0,3-2 0,0-1 0,1 0 0,-1 0 0,0-1 0,0 0 0,0 0 0,-1 0 0,1-1 0,-1 1 0,0-1 0,0 0 0,-1-1 0,0 0 0,0 1 0,0-1 0,0 0 0,-1-1 0,0 1 0,0-1 0,-1 1 0,0-1 0,3-13 0,-4 15 0,0 0 0,-1 0 0,1 0 0,-1-1 0,0 1 0,0 0 0,-1 0 0,1 0 0,-1 0 0,0 0 0,-1 0 0,1 1 0,-4-9 0,3 10 0,0 0 0,0 0 0,0 1 0,-1-1 0,1 0 0,-1 1 0,1 0 0,-1-1 0,0 1 0,0 0 0,0 1 0,0-1 0,0 0 0,0 1 0,-1 0 0,1 0 0,0 0 0,-1 0 0,1 0 0,-1 0 0,-4 1 0,-4-1 0,0 1 0,0 1 0,0 0 0,0 1 0,0 0 0,-18 6 0,-74 29 0,53-17 0,29-11 0,37-13 0,39-12 0,-19 4 0,-14 4 0,1 1 0,29-5 0,25-7 0,-60 14 0,0 0 0,1 1 0,0 1 0,24-1 0,102-16 0,-106 17 0,-35 3 0,0 0 0,0-1 0,0 1 0,0 0 0,0-1 0,0 1 0,0-1 0,0 0 0,0 0 0,0 0 0,-1 0 0,1 0 0,0 0 0,0 0 0,1-2 0,-6 3 0,0-1 0,1 1 0,-1 0 0,0 0 0,0 0 0,0 0 0,0 1 0,0-1 0,0 1 0,-4 1 0,-45 14 0,-64 30 0,116-46 0,0 0 0,-1 0 0,1 0 0,0 0 0,0 1 0,0-1 0,0 0 0,0 0 0,-1 0 0,1 0 0,0 0 0,0 0 0,0 0 0,0 0 0,0 0 0,-1 0 0,1 1 0,0-1 0,0 0 0,0 0 0,0 0 0,0 0 0,0 0 0,0 0 0,0 1 0,0-1 0,0 0 0,0 0 0,0 0 0,-1 0 0,1 1 0,0-1 0,0 0 0,0 0 0,0 0 0,0 0 0,0 0 0,0 1 0,1-1 0,-1 0 0,0 0 0,0 0 0,0 0 0,0 1 0,0-1 0,0 0 0,0 0 0,0 0 0,0 0 0,0 0 0,0 0 0,0 1 0,1-1 0,-1 0 0,0 0 0,0 0 0,0 0 0,1 0 0,13 9 0,-11-8 0,0 0 0,0 1 0,0-1 0,-1 1 0,1 0 0,-1 0 0,1-1 0,-1 2 0,0-1 0,3 3 0,-2 3 0,0 1 0,-1 0 0,0 0 0,0 0 0,-1 0 0,0 0 0,-1 1 0,0-1 0,0 0 0,-1 0 0,0 0 0,-1 0 0,0 0 0,0 0 0,-1 0 0,0 0 0,0-1 0,-1 1 0,0-1 0,-1 0 0,0 0 0,-11 13 0,10-16 0,0-1 0,0 1 0,-1-1 0,0 0 0,0 0 0,0-1 0,-8 3 0,-16 8 0,16-7 0,0-1 0,-1-1 0,1 0 0,-1-1 0,0-1 0,0 0 0,0-1 0,0-1 0,-30-1 0,44 0 0,1 0 0,-1 0 0,0 0 0,0-1 0,1 1 0,-1 0 0,1 0 0,-1-1 0,0 1 0,1-1 0,-1 0 0,1 0 0,-1 1 0,1-1 0,-1 0 0,1 0 0,0 0 0,-1 0 0,1 0 0,0-1 0,0 1 0,0 0 0,0-1 0,0 1 0,0 0 0,0-1 0,1 1 0,-1-1 0,0 1 0,1-1 0,-1 0 0,1 1 0,0-1 0,-1 0 0,1 1 0,0-1 0,0 0 0,0 1 0,0-1 0,0 0 0,1 1 0,-1-1 0,0 0 0,1-1 0,1-2 0,-1 0 0,1 1 0,0-1 0,0 1 0,1-1 0,-1 1 0,1 0 0,0 0 0,0 0 0,0 0 0,1 1 0,-1-1 0,1 1 0,4-3 0,19-8 0,1 1 0,0 2 0,0 0 0,38-7 0,29-11 0,-65 20 0,-1 1 0,1 2 0,0 1 0,1 2 0,-1 1 0,41 2 0,-52-1 0,-1-1 0,28-5 0,34-4 0,-47 12-273,-1-3 0,1 0 0,0-2 0,60-16 0,-76 15-6553</inkml:trace>
+</inkml:ink>
 </file>
 
 <file path=word/theme/theme1.xml><?xml version="1.0" encoding="utf-8"?>

</xml_diff>